<commit_message>
Final pitch: add ICP, GTM, ASK slides + improve readability
- Added dedicated ICP slide (slide 6)
- Added Go-to-Market slide (slide 11)
- Redesigned ASK slide with card layout for readability
- Merged team into closing slide
- Updated pitch script docx with all 8 required elements
- Delivery guide with 5 key moments + checklist

Co-Authored-By: Claude Opus 4.6 (1M context) <noreply@anthropic.com>
</commit_message>
<xml_diff>
--- a/LY_Pitch_Script.docx
+++ b/LY_Pitch_Script.docx
@@ -2,6 +2,10 @@
 <file path=word/document.xml><?xml version="1.0" encoding="utf-8"?>
 <w:document xmlns:wpc="http://schemas.microsoft.com/office/word/2010/wordprocessingCanvas" xmlns:mo="http://schemas.microsoft.com/office/mac/office/2008/main" xmlns:mc="http://schemas.openxmlformats.org/markup-compatibility/2006" xmlns:mv="urn:schemas-microsoft-com:mac:vml" xmlns:o="urn:schemas-microsoft-com:office:office" xmlns:r="http://schemas.openxmlformats.org/officeDocument/2006/relationships" xmlns:m="http://schemas.openxmlformats.org/officeDocument/2006/math" xmlns:v="urn:schemas-microsoft-com:vml" xmlns:wp14="http://schemas.microsoft.com/office/word/2010/wordprocessingDrawing" xmlns:wp="http://schemas.openxmlformats.org/drawingml/2006/wordprocessingDrawing" xmlns:w10="urn:schemas-microsoft-com:office:word" xmlns:w="http://schemas.openxmlformats.org/wordprocessingml/2006/main" xmlns:w14="http://schemas.microsoft.com/office/word/2010/wordml" xmlns:wpg="http://schemas.microsoft.com/office/word/2010/wordprocessingGroup" xmlns:wpi="http://schemas.microsoft.com/office/word/2010/wordprocessingInk" xmlns:wne="http://schemas.microsoft.com/office/word/2006/wordml" xmlns:wps="http://schemas.microsoft.com/office/word/2010/wordprocessingShape" mc:Ignorable="w14 wp14">
   <w:body>
+    <w:p/>
+    <w:p/>
+    <w:p/>
+    <w:p/>
     <w:p>
       <w:pPr>
         <w:jc w:val="center"/>
@@ -10,9 +14,9 @@
         <w:rPr>
           <w:b/>
           <w:color w:val="6C5CE7"/>
-          <w:sz w:val="56"/>
+          <w:sz w:val="120"/>
         </w:rPr>
-        <w:t>LY - Final Pitch Script</w:t>
+        <w:t>LY</w:t>
       </w:r>
     </w:p>
     <w:p>
@@ -22,9 +26,22 @@
       <w:r>
         <w:rPr>
           <w:color w:val="636E72"/>
+          <w:sz w:val="36"/>
+        </w:rPr>
+        <w:t>Smart loyalty for independent businesses</w:t>
+      </w:r>
+    </w:p>
+    <w:p/>
+    <w:p>
+      <w:pPr>
+        <w:jc w:val="center"/>
+      </w:pPr>
+      <w:r>
+        <w:rPr>
+          <w:b/>
           <w:sz w:val="28"/>
         </w:rPr>
-        <w:t>4-Minute Presentation - VALI Bootcamp, ESMT Berlin</w:t>
+        <w:t>Final Pitch Script</w:t>
       </w:r>
     </w:p>
     <w:p>
@@ -36,7 +53,717 @@
           <w:color w:val="636E72"/>
           <w:sz w:val="22"/>
         </w:rPr>
-        <w:t>Romain Bouxirot - Alexander Berner - Athanasios Manios - Georgios Zelenitsas</w:t>
+        <w:t>VALI Bootcamp - ESMT Berlin - March 2026</w:t>
+      </w:r>
+    </w:p>
+    <w:p/>
+    <w:p/>
+    <w:p>
+      <w:pPr>
+        <w:jc w:val="center"/>
+      </w:pPr>
+      <w:r>
+        <w:rPr>
+          <w:color w:val="636E72"/>
+          <w:sz w:val="22"/>
+        </w:rPr>
+        <w:t>Alexander Berner  |  Georgios Zelenitsas  |  Athanasios Manios  |  Romain Bouxirot</w:t>
+      </w:r>
+    </w:p>
+    <w:p>
+      <w:r>
+        <w:br w:type="page"/>
+      </w:r>
+    </w:p>
+    <w:p>
+      <w:r>
+        <w:rPr>
+          <w:b/>
+          <w:color w:val="6C5CE7"/>
+          <w:sz w:val="40"/>
+        </w:rPr>
+        <w:t>PITCH OVERVIEW</w:t>
+      </w:r>
+    </w:p>
+    <w:p/>
+    <w:p>
+      <w:r>
+        <w:rPr>
+          <w:color w:val="636E72"/>
+          <w:sz w:val="24"/>
+        </w:rPr>
+        <w:t>13 slides  |  ~3:40 total  |  20 seconds buffer</w:t>
+      </w:r>
+    </w:p>
+    <w:p/>
+    <w:tbl>
+      <w:tblPr>
+        <w:tblStyle w:val="LightGrid-Accent1"/>
+        <w:tblW w:type="auto" w:w="0"/>
+        <w:tblLook w:firstColumn="1" w:firstRow="1" w:lastColumn="0" w:lastRow="0" w:noHBand="0" w:noVBand="1" w:val="04A0"/>
+      </w:tblPr>
+      <w:tblGrid>
+        <w:gridCol w:w="2160"/>
+        <w:gridCol w:w="2160"/>
+        <w:gridCol w:w="2160"/>
+        <w:gridCol w:w="2160"/>
+      </w:tblGrid>
+      <w:tr>
+        <w:tc>
+          <w:tcPr>
+            <w:tcW w:type="dxa" w:w="2160"/>
+          </w:tcPr>
+          <w:p>
+            <w:r>
+              <w:t>Slide</w:t>
+            </w:r>
+          </w:p>
+        </w:tc>
+        <w:tc>
+          <w:tcPr>
+            <w:tcW w:type="dxa" w:w="2160"/>
+          </w:tcPr>
+          <w:p>
+            <w:r>
+              <w:t>Title</w:t>
+            </w:r>
+          </w:p>
+        </w:tc>
+        <w:tc>
+          <w:tcPr>
+            <w:tcW w:type="dxa" w:w="2160"/>
+          </w:tcPr>
+          <w:p>
+            <w:r>
+              <w:t>Element</w:t>
+            </w:r>
+          </w:p>
+        </w:tc>
+        <w:tc>
+          <w:tcPr>
+            <w:tcW w:type="dxa" w:w="2160"/>
+          </w:tcPr>
+          <w:p>
+            <w:r>
+              <w:t>Time</w:t>
+            </w:r>
+          </w:p>
+        </w:tc>
+      </w:tr>
+      <w:tr>
+        <w:tc>
+          <w:tcPr>
+            <w:tcW w:type="dxa" w:w="2160"/>
+          </w:tcPr>
+          <w:p>
+            <w:r>
+              <w:t>1</w:t>
+            </w:r>
+          </w:p>
+        </w:tc>
+        <w:tc>
+          <w:tcPr>
+            <w:tcW w:type="dxa" w:w="2160"/>
+          </w:tcPr>
+          <w:p>
+            <w:r>
+              <w:t>Title</w:t>
+            </w:r>
+          </w:p>
+        </w:tc>
+        <w:tc>
+          <w:tcPr>
+            <w:tcW w:type="dxa" w:w="2160"/>
+          </w:tcPr>
+          <w:p>
+            <w:r>
+              <w:t>HOOK</w:t>
+            </w:r>
+          </w:p>
+        </w:tc>
+        <w:tc>
+          <w:tcPr>
+            <w:tcW w:type="dxa" w:w="2160"/>
+          </w:tcPr>
+          <w:p>
+            <w:r>
+              <w:t>5s</w:t>
+            </w:r>
+          </w:p>
+        </w:tc>
+      </w:tr>
+      <w:tr>
+        <w:tc>
+          <w:tcPr>
+            <w:tcW w:type="dxa" w:w="2160"/>
+          </w:tcPr>
+          <w:p>
+            <w:r>
+              <w:t>2</w:t>
+            </w:r>
+          </w:p>
+        </w:tc>
+        <w:tc>
+          <w:tcPr>
+            <w:tcW w:type="dxa" w:w="2160"/>
+          </w:tcPr>
+          <w:p>
+            <w:r>
+              <w:t>Story Hook</w:t>
+            </w:r>
+          </w:p>
+        </w:tc>
+        <w:tc>
+          <w:tcPr>
+            <w:tcW w:type="dxa" w:w="2160"/>
+          </w:tcPr>
+          <w:p>
+            <w:r>
+              <w:t>HOOK</w:t>
+            </w:r>
+          </w:p>
+        </w:tc>
+        <w:tc>
+          <w:tcPr>
+            <w:tcW w:type="dxa" w:w="2160"/>
+          </w:tcPr>
+          <w:p>
+            <w:r>
+              <w:t>30s</w:t>
+            </w:r>
+          </w:p>
+        </w:tc>
+      </w:tr>
+      <w:tr>
+        <w:tc>
+          <w:tcPr>
+            <w:tcW w:type="dxa" w:w="2160"/>
+          </w:tcPr>
+          <w:p>
+            <w:r>
+              <w:t>3</w:t>
+            </w:r>
+          </w:p>
+        </w:tc>
+        <w:tc>
+          <w:tcPr>
+            <w:tcW w:type="dxa" w:w="2160"/>
+          </w:tcPr>
+          <w:p>
+            <w:r>
+              <w:t>The Problem</w:t>
+            </w:r>
+          </w:p>
+        </w:tc>
+        <w:tc>
+          <w:tcPr>
+            <w:tcW w:type="dxa" w:w="2160"/>
+          </w:tcPr>
+          <w:p>
+            <w:r>
+              <w:t>PROBLEM</w:t>
+            </w:r>
+          </w:p>
+        </w:tc>
+        <w:tc>
+          <w:tcPr>
+            <w:tcW w:type="dxa" w:w="2160"/>
+          </w:tcPr>
+          <w:p>
+            <w:r>
+              <w:t>25s</w:t>
+            </w:r>
+          </w:p>
+        </w:tc>
+      </w:tr>
+      <w:tr>
+        <w:tc>
+          <w:tcPr>
+            <w:tcW w:type="dxa" w:w="2160"/>
+          </w:tcPr>
+          <w:p>
+            <w:r>
+              <w:t>4</w:t>
+            </w:r>
+          </w:p>
+        </w:tc>
+        <w:tc>
+          <w:tcPr>
+            <w:tcW w:type="dxa" w:w="2160"/>
+          </w:tcPr>
+          <w:p>
+            <w:r>
+              <w:t>Why Solutions Fail</w:t>
+            </w:r>
+          </w:p>
+        </w:tc>
+        <w:tc>
+          <w:tcPr>
+            <w:tcW w:type="dxa" w:w="2160"/>
+          </w:tcPr>
+          <w:p>
+            <w:r>
+              <w:t>PROBLEM</w:t>
+            </w:r>
+          </w:p>
+        </w:tc>
+        <w:tc>
+          <w:tcPr>
+            <w:tcW w:type="dxa" w:w="2160"/>
+          </w:tcPr>
+          <w:p>
+            <w:r>
+              <w:t>20s</w:t>
+            </w:r>
+          </w:p>
+        </w:tc>
+      </w:tr>
+      <w:tr>
+        <w:tc>
+          <w:tcPr>
+            <w:tcW w:type="dxa" w:w="2160"/>
+          </w:tcPr>
+          <w:p>
+            <w:r>
+              <w:t>5</w:t>
+            </w:r>
+          </w:p>
+        </w:tc>
+        <w:tc>
+          <w:tcPr>
+            <w:tcW w:type="dxa" w:w="2160"/>
+          </w:tcPr>
+          <w:p>
+            <w:r>
+              <w:t>Our Solution</w:t>
+            </w:r>
+          </w:p>
+        </w:tc>
+        <w:tc>
+          <w:tcPr>
+            <w:tcW w:type="dxa" w:w="2160"/>
+          </w:tcPr>
+          <w:p>
+            <w:r>
+              <w:t>SOLUTION</w:t>
+            </w:r>
+          </w:p>
+        </w:tc>
+        <w:tc>
+          <w:tcPr>
+            <w:tcW w:type="dxa" w:w="2160"/>
+          </w:tcPr>
+          <w:p>
+            <w:r>
+              <w:t>15s</w:t>
+            </w:r>
+          </w:p>
+        </w:tc>
+      </w:tr>
+      <w:tr>
+        <w:tc>
+          <w:tcPr>
+            <w:tcW w:type="dxa" w:w="2160"/>
+          </w:tcPr>
+          <w:p>
+            <w:r>
+              <w:t>6</w:t>
+            </w:r>
+          </w:p>
+        </w:tc>
+        <w:tc>
+          <w:tcPr>
+            <w:tcW w:type="dxa" w:w="2160"/>
+          </w:tcPr>
+          <w:p>
+            <w:r>
+              <w:t>Our ICP</w:t>
+            </w:r>
+          </w:p>
+        </w:tc>
+        <w:tc>
+          <w:tcPr>
+            <w:tcW w:type="dxa" w:w="2160"/>
+          </w:tcPr>
+          <w:p>
+            <w:r>
+              <w:t>ICP</w:t>
+            </w:r>
+          </w:p>
+        </w:tc>
+        <w:tc>
+          <w:tcPr>
+            <w:tcW w:type="dxa" w:w="2160"/>
+          </w:tcPr>
+          <w:p>
+            <w:r>
+              <w:t>15s</w:t>
+            </w:r>
+          </w:p>
+        </w:tc>
+      </w:tr>
+      <w:tr>
+        <w:tc>
+          <w:tcPr>
+            <w:tcW w:type="dxa" w:w="2160"/>
+          </w:tcPr>
+          <w:p>
+            <w:r>
+              <w:t>7</w:t>
+            </w:r>
+          </w:p>
+        </w:tc>
+        <w:tc>
+          <w:tcPr>
+            <w:tcW w:type="dxa" w:w="2160"/>
+          </w:tcPr>
+          <w:p>
+            <w:r>
+              <w:t>How It Works</w:t>
+            </w:r>
+          </w:p>
+        </w:tc>
+        <w:tc>
+          <w:tcPr>
+            <w:tcW w:type="dxa" w:w="2160"/>
+          </w:tcPr>
+          <w:p>
+            <w:r>
+              <w:t>MVP</w:t>
+            </w:r>
+          </w:p>
+        </w:tc>
+        <w:tc>
+          <w:tcPr>
+            <w:tcW w:type="dxa" w:w="2160"/>
+          </w:tcPr>
+          <w:p>
+            <w:r>
+              <w:t>25s</w:t>
+            </w:r>
+          </w:p>
+        </w:tc>
+      </w:tr>
+      <w:tr>
+        <w:tc>
+          <w:tcPr>
+            <w:tcW w:type="dxa" w:w="2160"/>
+          </w:tcPr>
+          <w:p>
+            <w:r>
+              <w:t>8</w:t>
+            </w:r>
+          </w:p>
+        </w:tc>
+        <w:tc>
+          <w:tcPr>
+            <w:tcW w:type="dxa" w:w="2160"/>
+          </w:tcPr>
+          <w:p>
+            <w:r>
+              <w:t>What We Built</w:t>
+            </w:r>
+          </w:p>
+        </w:tc>
+        <w:tc>
+          <w:tcPr>
+            <w:tcW w:type="dxa" w:w="2160"/>
+          </w:tcPr>
+          <w:p>
+            <w:r>
+              <w:t>MVP</w:t>
+            </w:r>
+          </w:p>
+        </w:tc>
+        <w:tc>
+          <w:tcPr>
+            <w:tcW w:type="dxa" w:w="2160"/>
+          </w:tcPr>
+          <w:p>
+            <w:r>
+              <w:t>15s</w:t>
+            </w:r>
+          </w:p>
+        </w:tc>
+      </w:tr>
+      <w:tr>
+        <w:tc>
+          <w:tcPr>
+            <w:tcW w:type="dxa" w:w="2160"/>
+          </w:tcPr>
+          <w:p>
+            <w:r>
+              <w:t>9</w:t>
+            </w:r>
+          </w:p>
+        </w:tc>
+        <w:tc>
+          <w:tcPr>
+            <w:tcW w:type="dxa" w:w="2160"/>
+          </w:tcPr>
+          <w:p>
+            <w:r>
+              <w:t>Validation + Pricing</w:t>
+            </w:r>
+          </w:p>
+        </w:tc>
+        <w:tc>
+          <w:tcPr>
+            <w:tcW w:type="dxa" w:w="2160"/>
+          </w:tcPr>
+          <w:p>
+            <w:r>
+              <w:t>MARKET + GTM</w:t>
+            </w:r>
+          </w:p>
+        </w:tc>
+        <w:tc>
+          <w:tcPr>
+            <w:tcW w:type="dxa" w:w="2160"/>
+          </w:tcPr>
+          <w:p>
+            <w:r>
+              <w:t>25s</w:t>
+            </w:r>
+          </w:p>
+        </w:tc>
+      </w:tr>
+      <w:tr>
+        <w:tc>
+          <w:tcPr>
+            <w:tcW w:type="dxa" w:w="2160"/>
+          </w:tcPr>
+          <w:p>
+            <w:r>
+              <w:t>10</w:t>
+            </w:r>
+          </w:p>
+        </w:tc>
+        <w:tc>
+          <w:tcPr>
+            <w:tcW w:type="dxa" w:w="2160"/>
+          </w:tcPr>
+          <w:p>
+            <w:r>
+              <w:t>Market Size</w:t>
+            </w:r>
+          </w:p>
+        </w:tc>
+        <w:tc>
+          <w:tcPr>
+            <w:tcW w:type="dxa" w:w="2160"/>
+          </w:tcPr>
+          <w:p>
+            <w:r>
+              <w:t>MARKET</w:t>
+            </w:r>
+          </w:p>
+        </w:tc>
+        <w:tc>
+          <w:tcPr>
+            <w:tcW w:type="dxa" w:w="2160"/>
+          </w:tcPr>
+          <w:p>
+            <w:r>
+              <w:t>10s</w:t>
+            </w:r>
+          </w:p>
+        </w:tc>
+      </w:tr>
+      <w:tr>
+        <w:tc>
+          <w:tcPr>
+            <w:tcW w:type="dxa" w:w="2160"/>
+          </w:tcPr>
+          <w:p>
+            <w:r>
+              <w:t>11</w:t>
+            </w:r>
+          </w:p>
+        </w:tc>
+        <w:tc>
+          <w:tcPr>
+            <w:tcW w:type="dxa" w:w="2160"/>
+          </w:tcPr>
+          <w:p>
+            <w:r>
+              <w:t>Go-To-Market</w:t>
+            </w:r>
+          </w:p>
+        </w:tc>
+        <w:tc>
+          <w:tcPr>
+            <w:tcW w:type="dxa" w:w="2160"/>
+          </w:tcPr>
+          <w:p>
+            <w:r>
+              <w:t>GTM</w:t>
+            </w:r>
+          </w:p>
+        </w:tc>
+        <w:tc>
+          <w:tcPr>
+            <w:tcW w:type="dxa" w:w="2160"/>
+          </w:tcPr>
+          <w:p>
+            <w:r>
+              <w:t>15s</w:t>
+            </w:r>
+          </w:p>
+        </w:tc>
+      </w:tr>
+      <w:tr>
+        <w:tc>
+          <w:tcPr>
+            <w:tcW w:type="dxa" w:w="2160"/>
+          </w:tcPr>
+          <w:p>
+            <w:r>
+              <w:t>12</w:t>
+            </w:r>
+          </w:p>
+        </w:tc>
+        <w:tc>
+          <w:tcPr>
+            <w:tcW w:type="dxa" w:w="2160"/>
+          </w:tcPr>
+          <w:p>
+            <w:r>
+              <w:t>What We Need</w:t>
+            </w:r>
+          </w:p>
+        </w:tc>
+        <w:tc>
+          <w:tcPr>
+            <w:tcW w:type="dxa" w:w="2160"/>
+          </w:tcPr>
+          <w:p>
+            <w:r>
+              <w:t>ASK</w:t>
+            </w:r>
+          </w:p>
+        </w:tc>
+        <w:tc>
+          <w:tcPr>
+            <w:tcW w:type="dxa" w:w="2160"/>
+          </w:tcPr>
+          <w:p>
+            <w:r>
+              <w:t>10s</w:t>
+            </w:r>
+          </w:p>
+        </w:tc>
+      </w:tr>
+      <w:tr>
+        <w:tc>
+          <w:tcPr>
+            <w:tcW w:type="dxa" w:w="2160"/>
+          </w:tcPr>
+          <w:p>
+            <w:r>
+              <w:t>13</w:t>
+            </w:r>
+          </w:p>
+        </w:tc>
+        <w:tc>
+          <w:tcPr>
+            <w:tcW w:type="dxa" w:w="2160"/>
+          </w:tcPr>
+          <w:p>
+            <w:r>
+              <w:t>Closing + Team</w:t>
+            </w:r>
+          </w:p>
+        </w:tc>
+        <w:tc>
+          <w:tcPr>
+            <w:tcW w:type="dxa" w:w="2160"/>
+          </w:tcPr>
+          <w:p>
+            <w:r>
+              <w:t>TEAM</w:t>
+            </w:r>
+          </w:p>
+        </w:tc>
+        <w:tc>
+          <w:tcPr>
+            <w:tcW w:type="dxa" w:w="2160"/>
+          </w:tcPr>
+          <w:p>
+            <w:r>
+              <w:t>10s</w:t>
+            </w:r>
+          </w:p>
+        </w:tc>
+      </w:tr>
+    </w:tbl>
+    <w:p>
+      <w:r>
+        <w:br w:type="page"/>
+      </w:r>
+    </w:p>
+    <w:p>
+      <w:r>
+        <w:rPr>
+          <w:b/>
+          <w:color w:val="6C5CE7"/>
+          <w:sz w:val="40"/>
+        </w:rPr>
+        <w:t>SLIDE 1</w:t>
+      </w:r>
+      <w:r>
+        <w:rPr>
+          <w:b/>
+          <w:color w:val="2D3436"/>
+          <w:sz w:val="40"/>
+        </w:rPr>
+        <w:t xml:space="preserve">  TITLE</w:t>
+      </w:r>
+    </w:p>
+    <w:p>
+      <w:r>
+        <w:rPr>
+          <w:b/>
+          <w:color w:val="00D2D3"/>
+          <w:sz w:val="20"/>
+        </w:rPr>
+        <w:t>HOOK</w:t>
+      </w:r>
+      <w:r>
+        <w:rPr>
+          <w:color w:val="969696"/>
+          <w:sz w:val="20"/>
+        </w:rPr>
+        <w:t xml:space="preserve">  |  5 seconds</w:t>
+      </w:r>
+    </w:p>
+    <w:p/>
+    <w:p>
+      <w:r>
+        <w:rPr>
+          <w:i/>
+          <w:color w:val="969696"/>
+          <w:sz w:val="20"/>
+        </w:rPr>
+        <w:t>[Slide: LY logo on cafe background, tagline]</w:t>
+      </w:r>
+    </w:p>
+    <w:p/>
+    <w:p>
+      <w:r>
+        <w:rPr>
+          <w:sz w:val="26"/>
+        </w:rPr>
+        <w:t>"Good morning. We are Team LY."</w:t>
+      </w:r>
+    </w:p>
+    <w:p/>
+    <w:p>
+      <w:r>
+        <w:rPr>
+          <w:color w:val="DCDCDC"/>
+        </w:rPr>
+        <w:t>________________________________________________________________________________</w:t>
       </w:r>
     </w:p>
     <w:p/>
@@ -45,9 +772,45 @@
         <w:rPr>
           <w:b/>
           <w:color w:val="6C5CE7"/>
-          <w:sz w:val="32"/>
+          <w:sz w:val="40"/>
         </w:rPr>
-        <w:t>SLIDE 1 - TITLE</w:t>
+        <w:t>SLIDE 2</w:t>
+      </w:r>
+      <w:r>
+        <w:rPr>
+          <w:b/>
+          <w:color w:val="2D3436"/>
+          <w:sz w:val="40"/>
+        </w:rPr>
+        <w:t xml:space="preserve">  THE STORY</w:t>
+      </w:r>
+    </w:p>
+    <w:p>
+      <w:r>
+        <w:rPr>
+          <w:b/>
+          <w:color w:val="00D2D3"/>
+          <w:sz w:val="20"/>
+        </w:rPr>
+        <w:t>HOOK</w:t>
+      </w:r>
+      <w:r>
+        <w:rPr>
+          <w:color w:val="969696"/>
+          <w:sz w:val="20"/>
+        </w:rPr>
+        <w:t xml:space="preserve">  |  30 seconds</w:t>
+      </w:r>
+    </w:p>
+    <w:p/>
+    <w:p>
+      <w:r>
+        <w:rPr>
+          <w:i/>
+          <w:color w:val="969696"/>
+          <w:sz w:val="20"/>
+        </w:rPr>
+        <w:t>[Slide: Dark cinematic background, barista image]</w:t>
       </w:r>
     </w:p>
     <w:p>
@@ -57,68 +820,14 @@
           <w:color w:val="969696"/>
           <w:sz w:val="20"/>
         </w:rPr>
-        <w:t>Duration: 5 seconds</w:t>
-      </w:r>
-    </w:p>
-    <w:p>
-      <w:r>
-        <w:rPr>
-          <w:i/>
-          <w:color w:val="969696"/>
-          <w:sz w:val="20"/>
-        </w:rPr>
-        <w:t>[Slide: LY logo, tagline, team names]</w:t>
+        <w:t>[Slow pace. Eye contact. Let the silence work.]</w:t>
       </w:r>
     </w:p>
     <w:p/>
     <w:p>
       <w:r>
         <w:rPr>
-          <w:sz w:val="24"/>
-        </w:rPr>
-        <w:t>"Good morning. We are Team LY."</w:t>
-      </w:r>
-    </w:p>
-    <w:p>
-      <w:r>
-        <w:t>______________________________________________________________________</w:t>
-      </w:r>
-    </w:p>
-    <w:p>
-      <w:r>
-        <w:rPr>
-          <w:b/>
-          <w:color w:val="6C5CE7"/>
-          <w:sz w:val="32"/>
-        </w:rPr>
-        <w:t>SLIDE 2 - THE STORY HOOK</w:t>
-      </w:r>
-    </w:p>
-    <w:p>
-      <w:r>
-        <w:rPr>
-          <w:i/>
-          <w:color w:val="969696"/>
-          <w:sz w:val="20"/>
-        </w:rPr>
-        <w:t>Duration: 30 seconds</w:t>
-      </w:r>
-    </w:p>
-    <w:p>
-      <w:r>
-        <w:rPr>
-          <w:i/>
-          <w:color w:val="969696"/>
-          <w:sz w:val="20"/>
-        </w:rPr>
-        <w:t>[Slide: Francesca quote, dark cinematic background]</w:t>
-      </w:r>
-    </w:p>
-    <w:p/>
-    <w:p>
-      <w:r>
-        <w:rPr>
-          <w:sz w:val="24"/>
+          <w:sz w:val="26"/>
         </w:rPr>
         <w:t>"Monday morning. 7:15. Francesca opens her coffee shop in Kreuzberg."</w:t>
       </w:r>
@@ -127,7 +836,7 @@
     <w:p>
       <w:r>
         <w:rPr>
-          <w:sz w:val="24"/>
+          <w:sz w:val="26"/>
         </w:rPr>
         <w:t>"Marco should be here by now. Double espresso, no sugar. Every Monday for three years."</w:t>
       </w:r>
@@ -136,7 +845,7 @@
     <w:p>
       <w:r>
         <w:rPr>
-          <w:sz w:val="24"/>
+          <w:sz w:val="26"/>
         </w:rPr>
         <w:t>"But Marco didn't come last Monday. Or the one before."</w:t>
       </w:r>
@@ -149,548 +858,78 @@
           <w:color w:val="969696"/>
           <w:sz w:val="20"/>
         </w:rPr>
-        <w:t>[Pause. Look at the audience.]</w:t>
+        <w:t>[PAUSE - 2 seconds. Look at audience.]</w:t>
       </w:r>
     </w:p>
     <w:p/>
     <w:p>
       <w:r>
         <w:rPr>
-          <w:sz w:val="24"/>
+          <w:sz w:val="26"/>
         </w:rPr>
-        <w:t>"Francesca remembers his birthday. His dog's name."</w:t>
+        <w:t>"Francesca remembers his birthday. His dog's name. The day he switched from cappuccino to espresso."</w:t>
       </w:r>
     </w:p>
     <w:p/>
     <w:p>
       <w:r>
         <w:rPr>
-          <w:sz w:val="24"/>
+          <w:sz w:val="26"/>
         </w:rPr>
-        <w:t>"But she had no way of knowing he was leaving. No alert. No signal. No second chance."</w:t>
+        <w:t>"But she had no way of knowing he was leaving."</w:t>
       </w:r>
     </w:p>
     <w:p>
       <w:r>
-        <w:t>______________________________________________________________________</w:t>
+        <w:rPr>
+          <w:sz w:val="26"/>
+        </w:rPr>
+        <w:t>"No alert. No signal. No second chance."</w:t>
+      </w:r>
+    </w:p>
+    <w:p/>
+    <w:p>
+      <w:r>
+        <w:rPr>
+          <w:color w:val="DCDCDC"/>
+        </w:rPr>
+        <w:t>________________________________________________________________________________</w:t>
+      </w:r>
+    </w:p>
+    <w:p/>
+    <w:p>
+      <w:r>
+        <w:rPr>
+          <w:b/>
+          <w:color w:val="6C5CE7"/>
+          <w:sz w:val="40"/>
+        </w:rPr>
+        <w:t>SLIDE 3</w:t>
+      </w:r>
+      <w:r>
+        <w:rPr>
+          <w:b/>
+          <w:color w:val="2D3436"/>
+          <w:sz w:val="40"/>
+        </w:rPr>
+        <w:t xml:space="preserve">  THE PROBLEM</w:t>
       </w:r>
     </w:p>
     <w:p>
       <w:r>
         <w:rPr>
           <w:b/>
-          <w:color w:val="6C5CE7"/>
-          <w:sz w:val="32"/>
+          <w:color w:val="00D2D3"/>
+          <w:sz w:val="20"/>
         </w:rPr>
-        <w:t>SLIDE 3 - THE PROBLEM</w:t>
+        <w:t>PROBLEM</w:t>
       </w:r>
-    </w:p>
-    <w:p>
       <w:r>
         <w:rPr>
-          <w:i/>
           <w:color w:val="969696"/>
           <w:sz w:val="20"/>
         </w:rPr>
-        <w:t>Duration: 30 seconds</w:t>
-      </w:r>
-    </w:p>
-    <w:p>
-      <w:r>
-        <w:rPr>
-          <w:i/>
-          <w:color w:val="969696"/>
-          <w:sz w:val="20"/>
-        </w:rPr>
-        <w:t>[Slide: 4 key statistics on dark background]</w:t>
-      </w:r>
-    </w:p>
-    <w:p/>
-    <w:p>
-      <w:r>
-        <w:rPr>
-          <w:sz w:val="24"/>
-        </w:rPr>
-        <w:t>"Now multiply Francesca by 10 million. That's how many independent food and beverage businesses across Europe face this exact problem."</w:t>
-      </w:r>
-    </w:p>
-    <w:p/>
-    <w:p>
-      <w:r>
-        <w:rPr>
-          <w:sz w:val="24"/>
-        </w:rPr>
-        <w:t>"78% of restaurant guests never come back after their first visit."</w:t>
-      </w:r>
-    </w:p>
-    <w:p>
-      <w:r>
-        <w:rPr>
-          <w:sz w:val="24"/>
-        </w:rPr>
-        <w:t>"Each restaurant loses roughly 375,000 euros a year to silent churn."</w:t>
-      </w:r>
-    </w:p>
-    <w:p>
-      <w:r>
-        <w:rPr>
-          <w:sz w:val="24"/>
-        </w:rPr>
-        <w:t>"Acquiring a new customer costs 5 to 7 times more than keeping one."</w:t>
-      </w:r>
-    </w:p>
-    <w:p/>
-    <w:p>
-      <w:r>
-        <w:rPr>
-          <w:sz w:val="24"/>
-        </w:rPr>
-        <w:t>"These businesses are bleeding revenue - and they don't even know it."</w:t>
-      </w:r>
-    </w:p>
-    <w:p>
-      <w:r>
-        <w:t>______________________________________________________________________</w:t>
-      </w:r>
-    </w:p>
-    <w:p>
-      <w:r>
-        <w:rPr>
-          <w:b/>
-          <w:color w:val="6C5CE7"/>
-          <w:sz w:val="32"/>
-        </w:rPr>
-        <w:t>SLIDE 4 - WHY SOLUTIONS FAIL</w:t>
-      </w:r>
-    </w:p>
-    <w:p>
-      <w:r>
-        <w:rPr>
-          <w:i/>
-          <w:color w:val="969696"/>
-          <w:sz w:val="20"/>
-        </w:rPr>
-        <w:t>Duration: 25 seconds</w:t>
-      </w:r>
-    </w:p>
-    <w:p>
-      <w:r>
-        <w:rPr>
-          <w:i/>
-          <w:color w:val="969696"/>
-          <w:sz w:val="20"/>
-        </w:rPr>
-        <w:t>[Slide: Stamp cards vs Enterprise CRMs]</w:t>
-      </w:r>
-    </w:p>
-    <w:p/>
-    <w:p>
-      <w:r>
-        <w:rPr>
-          <w:sz w:val="24"/>
-        </w:rPr>
-        <w:t>"The tools today fall into two buckets."</w:t>
-      </w:r>
-    </w:p>
-    <w:p/>
-    <w:p>
-      <w:r>
-        <w:rPr>
-          <w:sz w:val="24"/>
-        </w:rPr>
-        <w:t>"Stamp cards. Buy ten, get one free. No intelligence. Can't detect who's leaving."</w:t>
-      </w:r>
-    </w:p>
-    <w:p/>
-    <w:p>
-      <w:r>
-        <w:rPr>
-          <w:sz w:val="24"/>
-        </w:rPr>
-        <w:t>"Enterprise CRMs. HubSpot. Salesforce. Thousands per month. Not built for a 5-person cafe."</w:t>
-      </w:r>
-    </w:p>
-    <w:p/>
-    <w:p>
-      <w:r>
-        <w:rPr>
-          <w:sz w:val="24"/>
-        </w:rPr>
-        <w:t>"The gap? No affordable AI retention for independent European F&amp;B. Zero."</w:t>
-      </w:r>
-    </w:p>
-    <w:p>
-      <w:r>
-        <w:t>______________________________________________________________________</w:t>
-      </w:r>
-    </w:p>
-    <w:p>
-      <w:r>
-        <w:rPr>
-          <w:b/>
-          <w:color w:val="6C5CE7"/>
-          <w:sz w:val="32"/>
-        </w:rPr>
-        <w:t>SLIDE 5 - THE GAP + OUR SOLUTION</w:t>
-      </w:r>
-    </w:p>
-    <w:p>
-      <w:r>
-        <w:rPr>
-          <w:i/>
-          <w:color w:val="969696"/>
-          <w:sz w:val="20"/>
-        </w:rPr>
-        <w:t>Duration: 20 seconds</w:t>
-      </w:r>
-    </w:p>
-    <w:p>
-      <w:r>
-        <w:rPr>
-          <w:i/>
-          <w:color w:val="969696"/>
-          <w:sz w:val="20"/>
-        </w:rPr>
-        <w:t>[Slide: LY logo - "Your retention co-pilot"]</w:t>
-      </w:r>
-    </w:p>
-    <w:p/>
-    <w:p>
-      <w:r>
-        <w:rPr>
-          <w:sz w:val="24"/>
-        </w:rPr>
-        <w:t>"LY is a retention co-pilot for independent businesses."</w:t>
-      </w:r>
-    </w:p>
-    <w:p/>
-    <w:p>
-      <w:r>
-        <w:rPr>
-          <w:sz w:val="24"/>
-        </w:rPr>
-        <w:t>"We don't track loyalty points. We watch the patterns you can't see."</w:t>
-      </w:r>
-    </w:p>
-    <w:p>
-      <w:r>
-        <w:rPr>
-          <w:sz w:val="24"/>
-        </w:rPr>
-        <w:t>"We tell you who's leaving, when, and what to do about it."</w:t>
-      </w:r>
-    </w:p>
-    <w:p/>
-    <w:p>
-      <w:r>
-        <w:rPr>
-          <w:sz w:val="24"/>
-        </w:rPr>
-        <w:t>"Think of it as a smart marketing assistant - for 29 euros a month."</w:t>
-      </w:r>
-    </w:p>
-    <w:p>
-      <w:r>
-        <w:t>______________________________________________________________________</w:t>
-      </w:r>
-    </w:p>
-    <w:p>
-      <w:r>
-        <w:rPr>
-          <w:b/>
-          <w:color w:val="6C5CE7"/>
-          <w:sz w:val="32"/>
-        </w:rPr>
-        <w:t>SLIDE 6 - HOW IT WORKS</w:t>
-      </w:r>
-    </w:p>
-    <w:p>
-      <w:r>
-        <w:rPr>
-          <w:i/>
-          <w:color w:val="969696"/>
-          <w:sz w:val="20"/>
-        </w:rPr>
-        <w:t>Duration: 25 seconds</w:t>
-      </w:r>
-    </w:p>
-    <w:p>
-      <w:r>
-        <w:rPr>
-          <w:i/>
-          <w:color w:val="969696"/>
-          <w:sz w:val="20"/>
-        </w:rPr>
-        <w:t>[Slide: 4 steps with big numbers]</w:t>
-      </w:r>
-    </w:p>
-    <w:p/>
-    <w:p>
-      <w:r>
-        <w:rPr>
-          <w:sz w:val="24"/>
-        </w:rPr>
-        <w:t>"Here's how simple it is."</w:t>
-      </w:r>
-    </w:p>
-    <w:p/>
-    <w:p>
-      <w:r>
-        <w:rPr>
-          <w:sz w:val="24"/>
-        </w:rPr>
-        <w:t>"Step 1: Print a QR code. Counter. Done."</w:t>
-      </w:r>
-    </w:p>
-    <w:p>
-      <w:r>
-        <w:rPr>
-          <w:sz w:val="24"/>
-        </w:rPr>
-        <w:t>"Step 2: Customers scan. Name and phone. 15 seconds. No app download."</w:t>
-      </w:r>
-    </w:p>
-    <w:p>
-      <w:r>
-        <w:rPr>
-          <w:sz w:val="24"/>
-        </w:rPr>
-        <w:t>"Step 3: Employee scans their QR every visit. Automatic."</w:t>
-      </w:r>
-    </w:p>
-    <w:p>
-      <w:r>
-        <w:rPr>
-          <w:sz w:val="24"/>
-        </w:rPr>
-        <w:t>"Step 4: LY detects patterns. Marco absent 12 days? You get an alert. One WhatsApp message later - Marco is back."</w:t>
-      </w:r>
-    </w:p>
-    <w:p>
-      <w:r>
-        <w:t>______________________________________________________________________</w:t>
-      </w:r>
-    </w:p>
-    <w:p>
-      <w:r>
-        <w:rPr>
-          <w:b/>
-          <w:color w:val="6C5CE7"/>
-          <w:sz w:val="32"/>
-        </w:rPr>
-        <w:t>SLIDE 7 - WHAT WE BUILT</w:t>
-      </w:r>
-    </w:p>
-    <w:p>
-      <w:r>
-        <w:rPr>
-          <w:i/>
-          <w:color w:val="969696"/>
-          <w:sz w:val="20"/>
-        </w:rPr>
-        <w:t>Duration: 20 seconds</w:t>
-      </w:r>
-    </w:p>
-    <w:p>
-      <w:r>
-        <w:rPr>
-          <w:i/>
-          <w:color w:val="969696"/>
-          <w:sz w:val="20"/>
-        </w:rPr>
-        <w:t>[Slide: 6 feature cards - dark background]</w:t>
-      </w:r>
-    </w:p>
-    <w:p/>
-    <w:p>
-      <w:r>
-        <w:rPr>
-          <w:sz w:val="24"/>
-        </w:rPr>
-        <w:t>"We didn't just make a pitch deck. We built the product. It's live."</w:t>
-      </w:r>
-    </w:p>
-    <w:p/>
-    <w:p>
-      <w:r>
-        <w:rPr>
-          <w:sz w:val="24"/>
-        </w:rPr>
-        <w:t>"AI churn detection. Loyalty tiers. WhatsApp messaging. Custom rewards. Shop map. AI chatbot."</w:t>
-      </w:r>
-    </w:p>
-    <w:p/>
-    <w:p>
-      <w:r>
-        <w:rPr>
-          <w:sz w:val="24"/>
-        </w:rPr>
-        <w:t>"Try it right now at lyloyal.com."</w:t>
-      </w:r>
-    </w:p>
-    <w:p>
-      <w:r>
-        <w:t>______________________________________________________________________</w:t>
-      </w:r>
-    </w:p>
-    <w:p>
-      <w:r>
-        <w:rPr>
-          <w:b/>
-          <w:color w:val="6C5CE7"/>
-          <w:sz w:val="32"/>
-        </w:rPr>
-        <w:t>SLIDE 8 - VALIDATION + BUSINESS MODEL</w:t>
-      </w:r>
-    </w:p>
-    <w:p>
-      <w:r>
-        <w:rPr>
-          <w:i/>
-          <w:color w:val="969696"/>
-          <w:sz w:val="20"/>
-        </w:rPr>
-        <w:t>Duration: 25 seconds</w:t>
-      </w:r>
-    </w:p>
-    <w:p>
-      <w:r>
-        <w:rPr>
-          <w:i/>
-          <w:color w:val="969696"/>
-          <w:sz w:val="20"/>
-        </w:rPr>
-        <w:t>[Slide: Interview quotes + pricing tiers]</w:t>
-      </w:r>
-    </w:p>
-    <w:p/>
-    <w:p>
-      <w:r>
-        <w:rPr>
-          <w:sz w:val="24"/>
-        </w:rPr>
-        <w:t>"We talked to real shop owners in Berlin."</w:t>
-      </w:r>
-    </w:p>
-    <w:p/>
-    <w:p>
-      <w:r>
-        <w:rPr>
-          <w:sz w:val="24"/>
-        </w:rPr>
-        <w:t>"How do you know when a regular stops coming? - They don't. They just disappear."</w:t>
-      </w:r>
-    </w:p>
-    <w:p>
-      <w:r>
-        <w:rPr>
-          <w:sz w:val="24"/>
-        </w:rPr>
-        <w:t>"What digital tools do you use? - None."</w:t>
-      </w:r>
-    </w:p>
-    <w:p>
-      <w:r>
-        <w:rPr>
-          <w:sz w:val="24"/>
-        </w:rPr>
-        <w:t>"If we told you who's about to leave? - I'd call them immediately."</w:t>
-      </w:r>
-    </w:p>
-    <w:p/>
-    <w:p>
-      <w:r>
-        <w:rPr>
-          <w:sz w:val="24"/>
-        </w:rPr>
-        <w:t>"Freemium SaaS. Free to start. Growth at 29 euros. Pro at 79."</w:t>
-      </w:r>
-    </w:p>
-    <w:p>
-      <w:r>
-        <w:rPr>
-          <w:sz w:val="24"/>
-        </w:rPr>
-        <w:t>"Recovering 2 lost regulars per month pays for the entire subscription."</w:t>
-      </w:r>
-    </w:p>
-    <w:p>
-      <w:r>
-        <w:t>______________________________________________________________________</w:t>
-      </w:r>
-    </w:p>
-    <w:p>
-      <w:r>
-        <w:rPr>
-          <w:b/>
-          <w:color w:val="6C5CE7"/>
-          <w:sz w:val="32"/>
-        </w:rPr>
-        <w:t>SLIDE 9 - TEAM</w:t>
-      </w:r>
-    </w:p>
-    <w:p>
-      <w:r>
-        <w:rPr>
-          <w:i/>
-          <w:color w:val="969696"/>
-          <w:sz w:val="20"/>
-        </w:rPr>
-        <w:t>Duration: 10 seconds</w:t>
-      </w:r>
-    </w:p>
-    <w:p>
-      <w:r>
-        <w:rPr>
-          <w:i/>
-          <w:color w:val="969696"/>
-          <w:sz w:val="20"/>
-        </w:rPr>
-        <w:t>[Slide: 4 team members]</w:t>
-      </w:r>
-    </w:p>
-    <w:p/>
-    <w:p>
-      <w:r>
-        <w:rPr>
-          <w:sz w:val="24"/>
-        </w:rPr>
-        <w:t>"Four founders. Product and tech, business development, market research, and strategy. Built at ESMT Berlin."</w:t>
-      </w:r>
-    </w:p>
-    <w:p>
-      <w:r>
-        <w:t>______________________________________________________________________</w:t>
-      </w:r>
-    </w:p>
-    <w:p>
-      <w:r>
-        <w:rPr>
-          <w:b/>
-          <w:color w:val="6C5CE7"/>
-          <w:sz w:val="32"/>
-        </w:rPr>
-        <w:t>SLIDE 10 - CLOSING</w:t>
-      </w:r>
-    </w:p>
-    <w:p>
-      <w:r>
-        <w:rPr>
-          <w:i/>
-          <w:color w:val="969696"/>
-          <w:sz w:val="20"/>
-        </w:rPr>
-        <w:t>Duration: 10 seconds</w:t>
-      </w:r>
-    </w:p>
-    <w:p>
-      <w:r>
-        <w:rPr>
-          <w:i/>
-          <w:color w:val="969696"/>
-          <w:sz w:val="20"/>
-        </w:rPr>
-        <w:t>[Slide: LY logo + closing line]</w:t>
+        <w:t xml:space="preserve">  |  25 seconds</w:t>
       </w:r>
     </w:p>
     <w:p/>
@@ -701,14 +940,927 @@
           <w:color w:val="969696"/>
           <w:sz w:val="20"/>
         </w:rPr>
-        <w:t>[Slow down. Make eye contact.]</w:t>
+        <w:t>[Slide: 4 statistics - 10M+, 78%, 5-7x, EUR375K]</w:t>
       </w:r>
     </w:p>
     <w:p/>
     <w:p>
       <w:r>
         <w:rPr>
-          <w:sz w:val="24"/>
+          <w:sz w:val="26"/>
+        </w:rPr>
+        <w:t>"Now multiply Francesca by 10 million. That's how many independent food and beverage businesses across Europe face this exact problem - every single week."</w:t>
+      </w:r>
+    </w:p>
+    <w:p/>
+    <w:p>
+      <w:r>
+        <w:rPr>
+          <w:sz w:val="26"/>
+        </w:rPr>
+        <w:t>"78 percent of restaurant guests never come back after their first visit."</w:t>
+      </w:r>
+    </w:p>
+    <w:p/>
+    <w:p>
+      <w:r>
+        <w:rPr>
+          <w:sz w:val="26"/>
+        </w:rPr>
+        <w:t>"Each restaurant loses roughly 375,000 euros a year to silent churn. And acquiring a new customer costs 5 to 7 times more than keeping one."</w:t>
+      </w:r>
+    </w:p>
+    <w:p/>
+    <w:p>
+      <w:r>
+        <w:rPr>
+          <w:sz w:val="26"/>
+        </w:rPr>
+        <w:t>"These businesses are bleeding revenue - and they don't even know it."</w:t>
+      </w:r>
+    </w:p>
+    <w:p/>
+    <w:p>
+      <w:r>
+        <w:rPr>
+          <w:color w:val="DCDCDC"/>
+        </w:rPr>
+        <w:t>________________________________________________________________________________</w:t>
+      </w:r>
+    </w:p>
+    <w:p/>
+    <w:p>
+      <w:r>
+        <w:rPr>
+          <w:b/>
+          <w:color w:val="6C5CE7"/>
+          <w:sz w:val="40"/>
+        </w:rPr>
+        <w:t>SLIDE 4</w:t>
+      </w:r>
+      <w:r>
+        <w:rPr>
+          <w:b/>
+          <w:color w:val="2D3436"/>
+          <w:sz w:val="40"/>
+        </w:rPr>
+        <w:t xml:space="preserve">  WHY SOLUTIONS FAIL</w:t>
+      </w:r>
+    </w:p>
+    <w:p>
+      <w:r>
+        <w:rPr>
+          <w:b/>
+          <w:color w:val="00D2D3"/>
+          <w:sz w:val="20"/>
+        </w:rPr>
+        <w:t>PROBLEM</w:t>
+      </w:r>
+      <w:r>
+        <w:rPr>
+          <w:color w:val="969696"/>
+          <w:sz w:val="20"/>
+        </w:rPr>
+        <w:t xml:space="preserve">  |  20 seconds</w:t>
+      </w:r>
+    </w:p>
+    <w:p/>
+    <w:p>
+      <w:r>
+        <w:rPr>
+          <w:i/>
+          <w:color w:val="969696"/>
+          <w:sz w:val="20"/>
+        </w:rPr>
+        <w:t>[Slide: Two boxes - stamp cards vs enterprise CRMs]</w:t>
+      </w:r>
+    </w:p>
+    <w:p/>
+    <w:p>
+      <w:r>
+        <w:rPr>
+          <w:sz w:val="26"/>
+        </w:rPr>
+        <w:t>"The tools today fall into two buckets."</w:t>
+      </w:r>
+    </w:p>
+    <w:p/>
+    <w:p>
+      <w:r>
+        <w:rPr>
+          <w:sz w:val="26"/>
+        </w:rPr>
+        <w:t>"Stamp cards. Buy ten, get one free. No intelligence. They can't tell you who's leaving."</w:t>
+      </w:r>
+    </w:p>
+    <w:p/>
+    <w:p>
+      <w:r>
+        <w:rPr>
+          <w:sz w:val="26"/>
+        </w:rPr>
+        <w:t>"Enterprise CRMs. HubSpot. Salesforce. Thousands per month. Not built for someone who is the barista, the accountant, and the manager - all at once."</w:t>
+      </w:r>
+    </w:p>
+    <w:p/>
+    <w:p>
+      <w:r>
+        <w:rPr>
+          <w:sz w:val="26"/>
+        </w:rPr>
+        <w:t>"The gap? No affordable, AI-powered retention tool for independent European F&amp;B."</w:t>
+      </w:r>
+    </w:p>
+    <w:p>
+      <w:r>
+        <w:rPr>
+          <w:i/>
+          <w:color w:val="969696"/>
+          <w:sz w:val="20"/>
+        </w:rPr>
+        <w:t>[Pause]</w:t>
+      </w:r>
+    </w:p>
+    <w:p>
+      <w:r>
+        <w:rPr>
+          <w:sz w:val="26"/>
+        </w:rPr>
+        <w:t>"Zero."</w:t>
+      </w:r>
+    </w:p>
+    <w:p/>
+    <w:p>
+      <w:r>
+        <w:rPr>
+          <w:color w:val="DCDCDC"/>
+        </w:rPr>
+        <w:t>________________________________________________________________________________</w:t>
+      </w:r>
+    </w:p>
+    <w:p/>
+    <w:p>
+      <w:r>
+        <w:rPr>
+          <w:b/>
+          <w:color w:val="6C5CE7"/>
+          <w:sz w:val="40"/>
+        </w:rPr>
+        <w:t>SLIDE 5</w:t>
+      </w:r>
+      <w:r>
+        <w:rPr>
+          <w:b/>
+          <w:color w:val="2D3436"/>
+          <w:sz w:val="40"/>
+        </w:rPr>
+        <w:t xml:space="preserve">  OUR SOLUTION</w:t>
+      </w:r>
+    </w:p>
+    <w:p>
+      <w:r>
+        <w:rPr>
+          <w:b/>
+          <w:color w:val="00D2D3"/>
+          <w:sz w:val="20"/>
+        </w:rPr>
+        <w:t>SOLUTION</w:t>
+      </w:r>
+      <w:r>
+        <w:rPr>
+          <w:color w:val="969696"/>
+          <w:sz w:val="20"/>
+        </w:rPr>
+        <w:t xml:space="preserve">  |  15 seconds</w:t>
+      </w:r>
+    </w:p>
+    <w:p/>
+    <w:p>
+      <w:r>
+        <w:rPr>
+          <w:i/>
+          <w:color w:val="969696"/>
+          <w:sz w:val="20"/>
+        </w:rPr>
+        <w:t>[Slide: "Introducing" then LY logo then "Your retention co-pilot"]</w:t>
+      </w:r>
+    </w:p>
+    <w:p/>
+    <w:p>
+      <w:r>
+        <w:rPr>
+          <w:sz w:val="26"/>
+        </w:rPr>
+        <w:t>"LY is a retention co-pilot for independent businesses."</w:t>
+      </w:r>
+    </w:p>
+    <w:p/>
+    <w:p>
+      <w:r>
+        <w:rPr>
+          <w:sz w:val="26"/>
+        </w:rPr>
+        <w:t>"We don't track loyalty points. We watch the patterns you can't see. We tell you who's leaving, when, and exactly what to do about it."</w:t>
+      </w:r>
+    </w:p>
+    <w:p/>
+    <w:p>
+      <w:r>
+        <w:rPr>
+          <w:sz w:val="26"/>
+        </w:rPr>
+        <w:t>"Think of it as a smart marketing assistant - for 29 euros a month."</w:t>
+      </w:r>
+    </w:p>
+    <w:p/>
+    <w:p>
+      <w:r>
+        <w:rPr>
+          <w:color w:val="DCDCDC"/>
+        </w:rPr>
+        <w:t>________________________________________________________________________________</w:t>
+      </w:r>
+    </w:p>
+    <w:p/>
+    <w:p>
+      <w:r>
+        <w:rPr>
+          <w:b/>
+          <w:color w:val="6C5CE7"/>
+          <w:sz w:val="40"/>
+        </w:rPr>
+        <w:t>SLIDE 6</w:t>
+      </w:r>
+      <w:r>
+        <w:rPr>
+          <w:b/>
+          <w:color w:val="2D3436"/>
+          <w:sz w:val="40"/>
+        </w:rPr>
+        <w:t xml:space="preserve">  OUR ICP</w:t>
+      </w:r>
+    </w:p>
+    <w:p>
+      <w:r>
+        <w:rPr>
+          <w:b/>
+          <w:color w:val="00D2D3"/>
+          <w:sz w:val="20"/>
+        </w:rPr>
+        <w:t>ICP</w:t>
+      </w:r>
+      <w:r>
+        <w:rPr>
+          <w:color w:val="969696"/>
+          <w:sz w:val="20"/>
+        </w:rPr>
+        <w:t xml:space="preserve">  |  15 seconds</w:t>
+      </w:r>
+    </w:p>
+    <w:p/>
+    <w:p>
+      <w:r>
+        <w:rPr>
+          <w:i/>
+          <w:color w:val="969696"/>
+          <w:sz w:val="20"/>
+        </w:rPr>
+        <w:t>[Slide: ICP card with Who/Size/Where/Today/Trigger]</w:t>
+      </w:r>
+    </w:p>
+    <w:p/>
+    <w:p>
+      <w:r>
+        <w:rPr>
+          <w:sz w:val="26"/>
+        </w:rPr>
+        <w:t>"Our customer is Francesca. Owner-operator of an independent cafe, restaurant, or bakery. 100 to 500 weekly customers. 1 to 15 employees. Urban European markets."</w:t>
+      </w:r>
+    </w:p>
+    <w:p/>
+    <w:p>
+      <w:r>
+        <w:rPr>
+          <w:sz w:val="26"/>
+        </w:rPr>
+        <w:t>"She has a POS but no CRM, no loyalty program, and no data on who's leaving. She notices regulars are gone - but only when it's too late."</w:t>
+      </w:r>
+    </w:p>
+    <w:p/>
+    <w:p>
+      <w:r>
+        <w:rPr>
+          <w:color w:val="DCDCDC"/>
+        </w:rPr>
+        <w:t>________________________________________________________________________________</w:t>
+      </w:r>
+    </w:p>
+    <w:p/>
+    <w:p>
+      <w:r>
+        <w:rPr>
+          <w:b/>
+          <w:color w:val="6C5CE7"/>
+          <w:sz w:val="40"/>
+        </w:rPr>
+        <w:t>SLIDE 7</w:t>
+      </w:r>
+      <w:r>
+        <w:rPr>
+          <w:b/>
+          <w:color w:val="2D3436"/>
+          <w:sz w:val="40"/>
+        </w:rPr>
+        <w:t xml:space="preserve">  HOW IT WORKS</w:t>
+      </w:r>
+    </w:p>
+    <w:p>
+      <w:r>
+        <w:rPr>
+          <w:b/>
+          <w:color w:val="00D2D3"/>
+          <w:sz w:val="20"/>
+        </w:rPr>
+        <w:t>MVP</w:t>
+      </w:r>
+      <w:r>
+        <w:rPr>
+          <w:color w:val="969696"/>
+          <w:sz w:val="20"/>
+        </w:rPr>
+        <w:t xml:space="preserve">  |  25 seconds</w:t>
+      </w:r>
+    </w:p>
+    <w:p/>
+    <w:p>
+      <w:r>
+        <w:rPr>
+          <w:i/>
+          <w:color w:val="969696"/>
+          <w:sz w:val="20"/>
+        </w:rPr>
+        <w:t>[Slide: 4 steps with numbers]</w:t>
+      </w:r>
+    </w:p>
+    <w:p/>
+    <w:p>
+      <w:r>
+        <w:rPr>
+          <w:sz w:val="26"/>
+        </w:rPr>
+        <w:t>"Here's how simple it is."</w:t>
+      </w:r>
+    </w:p>
+    <w:p/>
+    <w:p>
+      <w:r>
+        <w:rPr>
+          <w:sz w:val="26"/>
+        </w:rPr>
+        <w:t>"Step 1: Print a QR code. Put it at the counter. Done."</w:t>
+      </w:r>
+    </w:p>
+    <w:p/>
+    <w:p>
+      <w:r>
+        <w:rPr>
+          <w:sz w:val="26"/>
+        </w:rPr>
+        <w:t>"Step 2: Customers scan it. Name and phone number. They get their personal loyalty QR code. No app download. 15 seconds."</w:t>
+      </w:r>
+    </w:p>
+    <w:p/>
+    <w:p>
+      <w:r>
+        <w:rPr>
+          <w:sz w:val="26"/>
+        </w:rPr>
+        <w:t>"Step 3: Every visit, your employee scans their QR. Visits tracked automatically."</w:t>
+      </w:r>
+    </w:p>
+    <w:p/>
+    <w:p>
+      <w:r>
+        <w:rPr>
+          <w:sz w:val="26"/>
+        </w:rPr>
+        <w:t>"Step 4: LY watches the patterns. When Marco hasn't been back in 12 days - and he usually comes every 3 - you get an alert. With a suggested action. One WhatsApp message later, Marco is back."</w:t>
+      </w:r>
+    </w:p>
+    <w:p/>
+    <w:p>
+      <w:r>
+        <w:rPr>
+          <w:color w:val="DCDCDC"/>
+        </w:rPr>
+        <w:t>________________________________________________________________________________</w:t>
+      </w:r>
+    </w:p>
+    <w:p/>
+    <w:p>
+      <w:r>
+        <w:rPr>
+          <w:b/>
+          <w:color w:val="6C5CE7"/>
+          <w:sz w:val="40"/>
+        </w:rPr>
+        <w:t>SLIDE 8</w:t>
+      </w:r>
+      <w:r>
+        <w:rPr>
+          <w:b/>
+          <w:color w:val="2D3436"/>
+          <w:sz w:val="40"/>
+        </w:rPr>
+        <w:t xml:space="preserve">  WHAT WE BUILT</w:t>
+      </w:r>
+    </w:p>
+    <w:p>
+      <w:r>
+        <w:rPr>
+          <w:b/>
+          <w:color w:val="00D2D3"/>
+          <w:sz w:val="20"/>
+        </w:rPr>
+        <w:t>MVP</w:t>
+      </w:r>
+      <w:r>
+        <w:rPr>
+          <w:color w:val="969696"/>
+          <w:sz w:val="20"/>
+        </w:rPr>
+        <w:t xml:space="preserve">  |  15 seconds</w:t>
+      </w:r>
+    </w:p>
+    <w:p/>
+    <w:p>
+      <w:r>
+        <w:rPr>
+          <w:i/>
+          <w:color w:val="969696"/>
+          <w:sz w:val="20"/>
+        </w:rPr>
+        <w:t>[Slide: 6 feature cards + lyloyal.com]</w:t>
+      </w:r>
+    </w:p>
+    <w:p/>
+    <w:p>
+      <w:r>
+        <w:rPr>
+          <w:sz w:val="26"/>
+        </w:rPr>
+        <w:t>"We didn't just make a pitch deck. We built the product. It's live."</w:t>
+      </w:r>
+    </w:p>
+    <w:p/>
+    <w:p>
+      <w:r>
+        <w:rPr>
+          <w:sz w:val="26"/>
+        </w:rPr>
+        <w:t>"AI churn detection. Loyalty tiers from Bronze to Platinum. One-click WhatsApp messaging. Custom reward rules. A public shop map. And an AI chatbot."</w:t>
+      </w:r>
+    </w:p>
+    <w:p/>
+    <w:p>
+      <w:r>
+        <w:rPr>
+          <w:sz w:val="26"/>
+        </w:rPr>
+        <w:t>"You can try it right now at lyloyal.com."</w:t>
+      </w:r>
+    </w:p>
+    <w:p>
+      <w:r>
+        <w:rPr>
+          <w:i/>
+          <w:color w:val="969696"/>
+          <w:sz w:val="20"/>
+        </w:rPr>
+        <w:t>[Point to the URL on screen]</w:t>
+      </w:r>
+    </w:p>
+    <w:p/>
+    <w:p>
+      <w:r>
+        <w:rPr>
+          <w:color w:val="DCDCDC"/>
+        </w:rPr>
+        <w:t>________________________________________________________________________________</w:t>
+      </w:r>
+    </w:p>
+    <w:p/>
+    <w:p>
+      <w:r>
+        <w:rPr>
+          <w:b/>
+          <w:color w:val="6C5CE7"/>
+          <w:sz w:val="40"/>
+        </w:rPr>
+        <w:t>SLIDE 9</w:t>
+      </w:r>
+      <w:r>
+        <w:rPr>
+          <w:b/>
+          <w:color w:val="2D3436"/>
+          <w:sz w:val="40"/>
+        </w:rPr>
+        <w:t xml:space="preserve">  VALIDATION + BUSINESS MODEL</w:t>
+      </w:r>
+    </w:p>
+    <w:p>
+      <w:r>
+        <w:rPr>
+          <w:b/>
+          <w:color w:val="00D2D3"/>
+          <w:sz w:val="20"/>
+        </w:rPr>
+        <w:t>MARKET + GTM</w:t>
+      </w:r>
+      <w:r>
+        <w:rPr>
+          <w:color w:val="969696"/>
+          <w:sz w:val="20"/>
+        </w:rPr>
+        <w:t xml:space="preserve">  |  25 seconds</w:t>
+      </w:r>
+    </w:p>
+    <w:p/>
+    <w:p>
+      <w:r>
+        <w:rPr>
+          <w:i/>
+          <w:color w:val="969696"/>
+          <w:sz w:val="20"/>
+        </w:rPr>
+        <w:t>[Slide: Split - interview quotes left, pricing right]</w:t>
+      </w:r>
+    </w:p>
+    <w:p/>
+    <w:p>
+      <w:r>
+        <w:rPr>
+          <w:sz w:val="26"/>
+        </w:rPr>
+        <w:t>"We went out and talked to real shop owners in Berlin."</w:t>
+      </w:r>
+    </w:p>
+    <w:p/>
+    <w:p>
+      <w:r>
+        <w:rPr>
+          <w:sz w:val="26"/>
+        </w:rPr>
+        <w:t>"How do you know when a regular stops coming?"</w:t>
+      </w:r>
+    </w:p>
+    <w:p>
+      <w:r>
+        <w:rPr>
+          <w:i/>
+          <w:color w:val="969696"/>
+          <w:sz w:val="20"/>
+        </w:rPr>
+        <w:t>[Pause] "They don't. They just disappear."</w:t>
+      </w:r>
+    </w:p>
+    <w:p/>
+    <w:p>
+      <w:r>
+        <w:rPr>
+          <w:sz w:val="26"/>
+        </w:rPr>
+        <w:t>"What digital tools do you use for retention?"</w:t>
+      </w:r>
+    </w:p>
+    <w:p>
+      <w:r>
+        <w:rPr>
+          <w:sz w:val="26"/>
+        </w:rPr>
+        <w:t>"None. They can't afford them."</w:t>
+      </w:r>
+    </w:p>
+    <w:p/>
+    <w:p>
+      <w:r>
+        <w:rPr>
+          <w:sz w:val="26"/>
+        </w:rPr>
+        <w:t>"If we could tell you who's about to leave?"</w:t>
+      </w:r>
+    </w:p>
+    <w:p>
+      <w:r>
+        <w:rPr>
+          <w:sz w:val="26"/>
+        </w:rPr>
+        <w:t>"I'd call them immediately."</w:t>
+      </w:r>
+    </w:p>
+    <w:p/>
+    <w:p>
+      <w:r>
+        <w:rPr>
+          <w:sz w:val="26"/>
+        </w:rPr>
+        <w:t>"Our model: freemium SaaS. Start free with 50 customers. Growth at 29 euros a month for AI churn detection and WhatsApp. Pro at 79 for multi-location."</w:t>
+      </w:r>
+    </w:p>
+    <w:p/>
+    <w:p>
+      <w:r>
+        <w:rPr>
+          <w:sz w:val="26"/>
+        </w:rPr>
+        <w:t>"The math is simple: recovering just 2 lost regulars per month pays for the entire subscription."</w:t>
+      </w:r>
+    </w:p>
+    <w:p/>
+    <w:p>
+      <w:r>
+        <w:rPr>
+          <w:color w:val="DCDCDC"/>
+        </w:rPr>
+        <w:t>________________________________________________________________________________</w:t>
+      </w:r>
+    </w:p>
+    <w:p/>
+    <w:p>
+      <w:r>
+        <w:rPr>
+          <w:b/>
+          <w:color w:val="6C5CE7"/>
+          <w:sz w:val="40"/>
+        </w:rPr>
+        <w:t>SLIDE 10</w:t>
+      </w:r>
+      <w:r>
+        <w:rPr>
+          <w:b/>
+          <w:color w:val="2D3436"/>
+          <w:sz w:val="40"/>
+        </w:rPr>
+        <w:t xml:space="preserve">  MARKET SIZE</w:t>
+      </w:r>
+    </w:p>
+    <w:p>
+      <w:r>
+        <w:rPr>
+          <w:b/>
+          <w:color w:val="00D2D3"/>
+          <w:sz w:val="20"/>
+        </w:rPr>
+        <w:t>MARKET</w:t>
+      </w:r>
+      <w:r>
+        <w:rPr>
+          <w:color w:val="969696"/>
+          <w:sz w:val="20"/>
+        </w:rPr>
+        <w:t xml:space="preserve">  |  10 seconds</w:t>
+      </w:r>
+    </w:p>
+    <w:p/>
+    <w:p>
+      <w:r>
+        <w:rPr>
+          <w:i/>
+          <w:color w:val="969696"/>
+          <w:sz w:val="20"/>
+        </w:rPr>
+        <w:t>[Slide: TAM/SAM/SOM - $6.6B / 5.5M / 275K]</w:t>
+      </w:r>
+    </w:p>
+    <w:p/>
+    <w:p>
+      <w:r>
+        <w:rPr>
+          <w:sz w:val="26"/>
+        </w:rPr>
+        <w:t>"The loyalty software market is 6.6 billion dollars, growing at 17% annually. 5.5 million independent F&amp;B businesses in Europe. Our near-term target: 275,000 at 5% penetration. Starting with Berlin."</w:t>
+      </w:r>
+    </w:p>
+    <w:p/>
+    <w:p>
+      <w:r>
+        <w:rPr>
+          <w:color w:val="DCDCDC"/>
+        </w:rPr>
+        <w:t>________________________________________________________________________________</w:t>
+      </w:r>
+    </w:p>
+    <w:p/>
+    <w:p>
+      <w:r>
+        <w:rPr>
+          <w:b/>
+          <w:color w:val="6C5CE7"/>
+          <w:sz w:val="40"/>
+        </w:rPr>
+        <w:t>SLIDE 11</w:t>
+      </w:r>
+      <w:r>
+        <w:rPr>
+          <w:b/>
+          <w:color w:val="2D3436"/>
+          <w:sz w:val="40"/>
+        </w:rPr>
+        <w:t xml:space="preserve">  GO-TO-MARKET</w:t>
+      </w:r>
+    </w:p>
+    <w:p>
+      <w:r>
+        <w:rPr>
+          <w:b/>
+          <w:color w:val="00D2D3"/>
+          <w:sz w:val="20"/>
+        </w:rPr>
+        <w:t>GTM</w:t>
+      </w:r>
+      <w:r>
+        <w:rPr>
+          <w:color w:val="969696"/>
+          <w:sz w:val="20"/>
+        </w:rPr>
+        <w:t xml:space="preserve">  |  15 seconds</w:t>
+      </w:r>
+    </w:p>
+    <w:p/>
+    <w:p>
+      <w:r>
+        <w:rPr>
+          <w:i/>
+          <w:color w:val="969696"/>
+          <w:sz w:val="20"/>
+        </w:rPr>
+        <w:t>[Slide: 4 GTM steps]</w:t>
+      </w:r>
+    </w:p>
+    <w:p/>
+    <w:p>
+      <w:r>
+        <w:rPr>
+          <w:sz w:val="26"/>
+        </w:rPr>
+        <w:t>"Our go-to-market is Berlin first. Door-to-door in Kreuzberg and Neukolln. Walk into 50 cafes with a tablet. Set them up in 2 minutes. Free tier means zero risk."</w:t>
+      </w:r>
+    </w:p>
+    <w:p/>
+    <w:p>
+      <w:r>
+        <w:rPr>
+          <w:sz w:val="26"/>
+        </w:rPr>
+        <w:t>"Then pop-up loyalty events. Partner with cafes for LY Day - free coffee for customers who sign up. Viral loop."</w:t>
+      </w:r>
+    </w:p>
+    <w:p/>
+    <w:p>
+      <w:r>
+        <w:rPr>
+          <w:sz w:val="26"/>
+        </w:rPr>
+        <w:t>"The shop map creates a network effect. More shops, more customers, more shops. And once owners see churn alerts work - upgrading to Growth is a no-brainer."</w:t>
+      </w:r>
+    </w:p>
+    <w:p/>
+    <w:p>
+      <w:r>
+        <w:rPr>
+          <w:color w:val="DCDCDC"/>
+        </w:rPr>
+        <w:t>________________________________________________________________________________</w:t>
+      </w:r>
+    </w:p>
+    <w:p/>
+    <w:p>
+      <w:r>
+        <w:rPr>
+          <w:b/>
+          <w:color w:val="6C5CE7"/>
+          <w:sz w:val="40"/>
+        </w:rPr>
+        <w:t>SLIDE 12</w:t>
+      </w:r>
+      <w:r>
+        <w:rPr>
+          <w:b/>
+          <w:color w:val="2D3436"/>
+          <w:sz w:val="40"/>
+        </w:rPr>
+        <w:t xml:space="preserve">  WHAT WE NEED</w:t>
+      </w:r>
+    </w:p>
+    <w:p>
+      <w:r>
+        <w:rPr>
+          <w:b/>
+          <w:color w:val="00D2D3"/>
+          <w:sz w:val="20"/>
+        </w:rPr>
+        <w:t>ASK</w:t>
+      </w:r>
+      <w:r>
+        <w:rPr>
+          <w:color w:val="969696"/>
+          <w:sz w:val="20"/>
+        </w:rPr>
+        <w:t xml:space="preserve">  |  10 seconds</w:t>
+      </w:r>
+    </w:p>
+    <w:p/>
+    <w:p>
+      <w:r>
+        <w:rPr>
+          <w:i/>
+          <w:color w:val="969696"/>
+          <w:sz w:val="20"/>
+        </w:rPr>
+        <w:t>[Slide: 4 icons - Pilots, Mentorship, Market Access, EUR50K]</w:t>
+      </w:r>
+    </w:p>
+    <w:p/>
+    <w:p>
+      <w:r>
+        <w:rPr>
+          <w:sz w:val="26"/>
+        </w:rPr>
+        <w:t>"What we need: 10 pilot cafes in Berlin. Mentorship from F&amp;B and SaaS experts through INNOVA EUROPE. Introductions to POS providers like SumUp. And 50,000 euros in pre-seed to hire one engineer and reach 100 shops by Q4."</w:t>
+      </w:r>
+    </w:p>
+    <w:p/>
+    <w:p>
+      <w:r>
+        <w:rPr>
+          <w:color w:val="DCDCDC"/>
+        </w:rPr>
+        <w:t>________________________________________________________________________________</w:t>
+      </w:r>
+    </w:p>
+    <w:p/>
+    <w:p>
+      <w:r>
+        <w:rPr>
+          <w:b/>
+          <w:color w:val="6C5CE7"/>
+          <w:sz w:val="40"/>
+        </w:rPr>
+        <w:t>SLIDE 13</w:t>
+      </w:r>
+      <w:r>
+        <w:rPr>
+          <w:b/>
+          <w:color w:val="2D3436"/>
+          <w:sz w:val="40"/>
+        </w:rPr>
+        <w:t xml:space="preserve">  CLOSING</w:t>
+      </w:r>
+    </w:p>
+    <w:p>
+      <w:r>
+        <w:rPr>
+          <w:b/>
+          <w:color w:val="00D2D3"/>
+          <w:sz w:val="20"/>
+        </w:rPr>
+        <w:t>TEAM</w:t>
+      </w:r>
+      <w:r>
+        <w:rPr>
+          <w:color w:val="969696"/>
+          <w:sz w:val="20"/>
+        </w:rPr>
+        <w:t xml:space="preserve">  |  10 seconds</w:t>
+      </w:r>
+    </w:p>
+    <w:p/>
+    <w:p>
+      <w:r>
+        <w:rPr>
+          <w:i/>
+          <w:color w:val="969696"/>
+          <w:sz w:val="20"/>
+        </w:rPr>
+        <w:t>[Slide: LY logo, closing line, team names, lyloyal.com]</w:t>
+      </w:r>
+    </w:p>
+    <w:p/>
+    <w:p>
+      <w:r>
+        <w:rPr>
+          <w:i/>
+          <w:color w:val="969696"/>
+          <w:sz w:val="20"/>
+        </w:rPr>
+        <w:t>[Slow down. Take a breath. Look at the audience.]</w:t>
+      </w:r>
+    </w:p>
+    <w:p/>
+    <w:p>
+      <w:r>
+        <w:rPr>
+          <w:sz w:val="26"/>
         </w:rPr>
         <w:t>"Because Francesca already has the heart for loyalty."</w:t>
       </w:r>
@@ -721,14 +1873,14 @@
           <w:color w:val="969696"/>
           <w:sz w:val="20"/>
         </w:rPr>
-        <w:t>[Pause]</w:t>
+        <w:t>[2-second pause]</w:t>
       </w:r>
     </w:p>
     <w:p/>
     <w:p>
       <w:r>
         <w:rPr>
-          <w:sz w:val="24"/>
+          <w:sz w:val="26"/>
         </w:rPr>
         <w:t>"LY just gives her the eyes."</w:t>
       </w:r>
@@ -737,7 +1889,18 @@
     <w:p>
       <w:r>
         <w:rPr>
-          <w:sz w:val="24"/>
+          <w:i/>
+          <w:color w:val="969696"/>
+          <w:sz w:val="20"/>
+        </w:rPr>
+        <w:t>[Pause. Nod.]</w:t>
+      </w:r>
+    </w:p>
+    <w:p/>
+    <w:p>
+      <w:r>
+        <w:rPr>
+          <w:sz w:val="26"/>
         </w:rPr>
         <w:t>"Thank you."</w:t>
       </w:r>
@@ -750,12 +1913,50 @@
           <w:color w:val="969696"/>
           <w:sz w:val="20"/>
         </w:rPr>
-        <w:t>[After applause:] "The product is live at lyloyal.com."</w:t>
+        <w:t>[Wait for applause, then:]</w:t>
       </w:r>
     </w:p>
     <w:p>
       <w:r>
-        <w:t>______________________________________________________________________</w:t>
+        <w:rPr>
+          <w:sz w:val="26"/>
+        </w:rPr>
+        <w:t>"We are Alexander, Georgios, Athanasios, and Romain. The product is live at lyloyal.com - we'd love your feedback."</w:t>
+      </w:r>
+    </w:p>
+    <w:p/>
+    <w:p>
+      <w:r>
+        <w:rPr>
+          <w:color w:val="DCDCDC"/>
+        </w:rPr>
+        <w:t>________________________________________________________________________________</w:t>
+      </w:r>
+    </w:p>
+    <w:p/>
+    <w:p>
+      <w:r>
+        <w:br w:type="page"/>
+      </w:r>
+    </w:p>
+    <w:p>
+      <w:r>
+        <w:rPr>
+          <w:b/>
+          <w:color w:val="6C5CE7"/>
+          <w:sz w:val="40"/>
+        </w:rPr>
+        <w:t>DELIVERY GUIDE</w:t>
+      </w:r>
+    </w:p>
+    <w:p/>
+    <w:p>
+      <w:r>
+        <w:rPr>
+          <w:b/>
+          <w:sz w:val="28"/>
+        </w:rPr>
+        <w:t>The 5 Moments That Make or Break This Pitch</w:t>
       </w:r>
     </w:p>
     <w:p/>
@@ -764,14 +1965,18 @@
         <w:rPr>
           <w:b/>
           <w:color w:val="6C5CE7"/>
-          <w:sz w:val="32"/>
+          <w:sz w:val="24"/>
         </w:rPr>
-        <w:t>TIMING SUMMARY</w:t>
+        <w:t>The Marco Story (Slide 2)</w:t>
       </w:r>
     </w:p>
     <w:p>
       <w:r>
-        <w:t>Total: ~3:25 - leaves 35 seconds buffer for pauses and audience reaction.</w:t>
+        <w:rPr>
+          <w:color w:val="505050"/>
+          <w:sz w:val="22"/>
+        </w:rPr>
+        <w:t>This is your ENTIRE pitch in miniature. If the audience feels something here, you win. Deliver it slowly. Make eye contact. Let the pauses breathe. The line "she had no way of knowing" should land like a punch. Do NOT rush this.</w:t>
       </w:r>
     </w:p>
     <w:p/>
@@ -780,9 +1985,89 @@
         <w:rPr>
           <w:b/>
           <w:color w:val="6C5CE7"/>
-          <w:sz w:val="32"/>
+          <w:sz w:val="24"/>
         </w:rPr>
-        <w:t>DELIVERY TIPS</w:t>
+        <w:t>The "Zero" (Slide 4)</w:t>
+      </w:r>
+    </w:p>
+    <w:p>
+      <w:r>
+        <w:rPr>
+          <w:color w:val="505050"/>
+          <w:sz w:val="22"/>
+        </w:rPr>
+        <w:t>After listing the gap, pause. Then say "Zero." alone. One word. Let it hang. This is where the audience realizes the opportunity is real.</w:t>
+      </w:r>
+    </w:p>
+    <w:p/>
+    <w:p>
+      <w:r>
+        <w:rPr>
+          <w:b/>
+          <w:color w:val="6C5CE7"/>
+          <w:sz w:val="24"/>
+        </w:rPr>
+        <w:t>The Live Product (Slide 8)</w:t>
+      </w:r>
+    </w:p>
+    <w:p>
+      <w:r>
+        <w:rPr>
+          <w:color w:val="505050"/>
+          <w:sz w:val="22"/>
+        </w:rPr>
+        <w:t>This is your unfair advantage. Most bootcamp teams have a slide deck. You have a working product. When you say "try it right now at lyloyal.com" - own it. This is the moment that separates you.</w:t>
+      </w:r>
+    </w:p>
+    <w:p/>
+    <w:p>
+      <w:r>
+        <w:rPr>
+          <w:b/>
+          <w:color w:val="6C5CE7"/>
+          <w:sz w:val="24"/>
+        </w:rPr>
+        <w:t>The Customer Quotes (Slide 9)</w:t>
+      </w:r>
+    </w:p>
+    <w:p>
+      <w:r>
+        <w:rPr>
+          <w:color w:val="505050"/>
+          <w:sz w:val="22"/>
+        </w:rPr>
+        <w:t>Deliver the quotes like you're reading a conversation. Not a slide. "How do you know when regulars leave?" [pause] "They don't. They just disappear." Make it feel like the audience is in the room with you and that cafe owner.</w:t>
+      </w:r>
+    </w:p>
+    <w:p/>
+    <w:p>
+      <w:r>
+        <w:rPr>
+          <w:b/>
+          <w:color w:val="6C5CE7"/>
+          <w:sz w:val="24"/>
+        </w:rPr>
+        <w:t>The Closing Line (Slide 13)</w:t>
+      </w:r>
+    </w:p>
+    <w:p>
+      <w:r>
+        <w:rPr>
+          <w:color w:val="505050"/>
+          <w:sz w:val="22"/>
+        </w:rPr>
+        <w:t>"Francesca already has the heart for loyalty. LY just gives her the eyes." This line is designed to be remembered. Say it slowly. With conviction. Do not add anything after "the eyes" except "Thank you." Less is more.</w:t>
+      </w:r>
+    </w:p>
+    <w:p/>
+    <w:p/>
+    <w:p>
+      <w:r>
+        <w:rPr>
+          <w:b/>
+          <w:sz w:val="28"/>
+        </w:rPr>
+        <w:t>Pre-Pitch Checklist</w:t>
       </w:r>
     </w:p>
     <w:p>
@@ -790,7 +2075,7 @@
         <w:pStyle w:val="ListBullet"/>
       </w:pPr>
       <w:r>
-        <w:t>The opening story is everything. Deliver it slowly. Make eye contact.</w:t>
+        <w:t>lyloyal.com open on a phone (for Q&amp;A demo)</w:t>
       </w:r>
     </w:p>
     <w:p>
@@ -798,7 +2083,7 @@
         <w:pStyle w:val="ListBullet"/>
       </w:pPr>
       <w:r>
-        <w:t>On "she had no way of knowing" - pause. Let it land.</w:t>
+        <w:t>Practice the Marco story 3 times out loud</w:t>
       </w:r>
     </w:p>
     <w:p>
@@ -806,7 +2091,7 @@
         <w:pStyle w:val="ListBullet"/>
       </w:pPr>
       <w:r>
-        <w:t>Have lyloyal.com open on a phone for the Q&amp;A demo.</w:t>
+        <w:t>Time the full pitch - aim for 3:40</w:t>
       </w:r>
     </w:p>
     <w:p>
@@ -814,7 +2099,7 @@
         <w:pStyle w:val="ListBullet"/>
       </w:pPr>
       <w:r>
-        <w:t>The closing line should be slow, with conviction.</w:t>
+        <w:t>Decide who presents which slides if splitting</w:t>
       </w:r>
     </w:p>
     <w:p>
@@ -822,7 +2107,15 @@
         <w:pStyle w:val="ListBullet"/>
       </w:pPr>
       <w:r>
-        <w:t>Practice 3 times. Time yourself.</w:t>
+        <w:t>Test the pitch.html presentation on the venue projector</w:t>
+      </w:r>
+    </w:p>
+    <w:p>
+      <w:pPr>
+        <w:pStyle w:val="ListBullet"/>
+      </w:pPr>
+      <w:r>
+        <w:t>Have a backup: pitch.html works offline (no internet needed)</w:t>
       </w:r>
     </w:p>
     <w:sectPr>
@@ -1198,6 +2491,9 @@
     <w:name w:val="Normal"/>
     <w:qFormat/>
     <w:rsid w:val="00FC693F"/>
+    <w:pPr>
+      <w:spacing w:after="80"/>
+    </w:pPr>
     <w:rPr>
       <w:rFonts w:ascii="Calibri" w:hAnsi="Calibri"/>
       <w:sz w:val="24"/>

</xml_diff>